<commit_message>
Feat: Ejercicio de la App "Reply" con diseño adaptable completado
</commit_message>
<xml_diff>
--- a/262DSMG123200127T6/Cuestionarios/Cuestionarios Unidad 4.docx
+++ b/262DSMG123200127T6/Cuestionarios/Cuestionarios Unidad 4.docx
@@ -400,6 +400,7 @@
         <w:rPr>
           <w:b/>
           <w:bCs/>
+          <w:noProof/>
         </w:rPr>
         <w:drawing>
           <wp:inline distT="0" distB="0" distL="0" distR="0" wp14:anchorId="12A240B9" wp14:editId="26A2D3F7">
@@ -449,6 +450,7 @@
         <w:rPr>
           <w:b/>
           <w:bCs/>
+          <w:noProof/>
         </w:rPr>
         <w:drawing>
           <wp:inline distT="0" distB="0" distL="0" distR="0" wp14:anchorId="34DDB9ED" wp14:editId="2DA1E8D4">
@@ -498,6 +500,7 @@
         <w:rPr>
           <w:b/>
           <w:bCs/>
+          <w:noProof/>
         </w:rPr>
         <w:drawing>
           <wp:inline distT="0" distB="0" distL="0" distR="0" wp14:anchorId="49503CC4" wp14:editId="49103767">
@@ -547,6 +550,7 @@
         <w:rPr>
           <w:b/>
           <w:bCs/>
+          <w:noProof/>
         </w:rPr>
         <w:lastRenderedPageBreak/>
         <w:drawing>
@@ -597,6 +601,7 @@
         <w:rPr>
           <w:b/>
           <w:bCs/>
+          <w:noProof/>
         </w:rPr>
         <w:drawing>
           <wp:inline distT="0" distB="0" distL="0" distR="0" wp14:anchorId="77CD0F75" wp14:editId="15269B2D">
@@ -649,29 +654,245 @@
           <w:bCs/>
         </w:rPr>
         <w:lastRenderedPageBreak/>
-        <w:t xml:space="preserve">RUTA </w:t>
-      </w:r>
-      <w:r>
-        <w:rPr>
-          <w:b/>
-          <w:bCs/>
-        </w:rPr>
-        <w:t>2</w:t>
-      </w:r>
-      <w:r>
-        <w:rPr>
-          <w:b/>
-          <w:bCs/>
-        </w:rPr>
-        <w:t xml:space="preserve">: CUESTIONARIO </w:t>
-      </w:r>
-    </w:p>
-    <w:p>
-      <w:pPr>
-        <w:rPr>
-          <w:lang w:val="es-ES"/>
-        </w:rPr>
-      </w:pPr>
+        <w:t xml:space="preserve">RUTA 2: CUESTIONARIO </w:t>
+      </w:r>
+    </w:p>
+    <w:p>
+      <w:pPr>
+        <w:rPr>
+          <w:lang w:val="es-ES"/>
+        </w:rPr>
+      </w:pPr>
+      <w:r>
+        <w:rPr>
+          <w:lang w:val="es-ES"/>
+        </w:rPr>
+        <w:drawing>
+          <wp:inline distT="0" distB="0" distL="0" distR="0" wp14:anchorId="647ACD96" wp14:editId="558A54F3">
+            <wp:extent cx="5731510" cy="3503930"/>
+            <wp:effectExtent l="0" t="0" r="2540" b="1270"/>
+            <wp:docPr id="337558069" name="Imagen 1"/>
+            <wp:cNvGraphicFramePr>
+              <a:graphicFrameLocks xmlns:a="http://schemas.openxmlformats.org/drawingml/2006/main" noChangeAspect="1"/>
+            </wp:cNvGraphicFramePr>
+            <a:graphic xmlns:a="http://schemas.openxmlformats.org/drawingml/2006/main">
+              <a:graphicData uri="http://schemas.openxmlformats.org/drawingml/2006/picture">
+                <pic:pic xmlns:pic="http://schemas.openxmlformats.org/drawingml/2006/picture">
+                  <pic:nvPicPr>
+                    <pic:cNvPr id="337558069" name=""/>
+                    <pic:cNvPicPr/>
+                  </pic:nvPicPr>
+                  <pic:blipFill>
+                    <a:blip r:embed="rId10"/>
+                    <a:stretch>
+                      <a:fillRect/>
+                    </a:stretch>
+                  </pic:blipFill>
+                  <pic:spPr>
+                    <a:xfrm>
+                      <a:off x="0" y="0"/>
+                      <a:ext cx="5731510" cy="3503930"/>
+                    </a:xfrm>
+                    <a:prstGeom prst="rect">
+                      <a:avLst/>
+                    </a:prstGeom>
+                  </pic:spPr>
+                </pic:pic>
+              </a:graphicData>
+            </a:graphic>
+          </wp:inline>
+        </w:drawing>
+      </w:r>
+    </w:p>
+    <w:p>
+      <w:pPr>
+        <w:rPr>
+          <w:lang w:val="es-ES"/>
+        </w:rPr>
+      </w:pPr>
+      <w:r>
+        <w:rPr>
+          <w:lang w:val="es-ES"/>
+        </w:rPr>
+        <w:drawing>
+          <wp:inline distT="0" distB="0" distL="0" distR="0" wp14:anchorId="3DDA766A" wp14:editId="0BA9FACC">
+            <wp:extent cx="5731510" cy="3159760"/>
+            <wp:effectExtent l="0" t="0" r="2540" b="2540"/>
+            <wp:docPr id="1780615135" name="Imagen 1"/>
+            <wp:cNvGraphicFramePr>
+              <a:graphicFrameLocks xmlns:a="http://schemas.openxmlformats.org/drawingml/2006/main" noChangeAspect="1"/>
+            </wp:cNvGraphicFramePr>
+            <a:graphic xmlns:a="http://schemas.openxmlformats.org/drawingml/2006/main">
+              <a:graphicData uri="http://schemas.openxmlformats.org/drawingml/2006/picture">
+                <pic:pic xmlns:pic="http://schemas.openxmlformats.org/drawingml/2006/picture">
+                  <pic:nvPicPr>
+                    <pic:cNvPr id="1780615135" name=""/>
+                    <pic:cNvPicPr/>
+                  </pic:nvPicPr>
+                  <pic:blipFill>
+                    <a:blip r:embed="rId11"/>
+                    <a:stretch>
+                      <a:fillRect/>
+                    </a:stretch>
+                  </pic:blipFill>
+                  <pic:spPr>
+                    <a:xfrm>
+                      <a:off x="0" y="0"/>
+                      <a:ext cx="5731510" cy="3159760"/>
+                    </a:xfrm>
+                    <a:prstGeom prst="rect">
+                      <a:avLst/>
+                    </a:prstGeom>
+                  </pic:spPr>
+                </pic:pic>
+              </a:graphicData>
+            </a:graphic>
+          </wp:inline>
+        </w:drawing>
+      </w:r>
+    </w:p>
+    <w:p>
+      <w:pPr>
+        <w:rPr>
+          <w:lang w:val="es-ES"/>
+        </w:rPr>
+      </w:pPr>
+      <w:r>
+        <w:rPr>
+          <w:lang w:val="es-ES"/>
+        </w:rPr>
+        <w:lastRenderedPageBreak/>
+        <w:drawing>
+          <wp:inline distT="0" distB="0" distL="0" distR="0" wp14:anchorId="2A5A7126" wp14:editId="69FCD189">
+            <wp:extent cx="5731510" cy="2870200"/>
+            <wp:effectExtent l="0" t="0" r="2540" b="6350"/>
+            <wp:docPr id="1464223040" name="Imagen 1"/>
+            <wp:cNvGraphicFramePr>
+              <a:graphicFrameLocks xmlns:a="http://schemas.openxmlformats.org/drawingml/2006/main" noChangeAspect="1"/>
+            </wp:cNvGraphicFramePr>
+            <a:graphic xmlns:a="http://schemas.openxmlformats.org/drawingml/2006/main">
+              <a:graphicData uri="http://schemas.openxmlformats.org/drawingml/2006/picture">
+                <pic:pic xmlns:pic="http://schemas.openxmlformats.org/drawingml/2006/picture">
+                  <pic:nvPicPr>
+                    <pic:cNvPr id="1464223040" name=""/>
+                    <pic:cNvPicPr/>
+                  </pic:nvPicPr>
+                  <pic:blipFill>
+                    <a:blip r:embed="rId12"/>
+                    <a:stretch>
+                      <a:fillRect/>
+                    </a:stretch>
+                  </pic:blipFill>
+                  <pic:spPr>
+                    <a:xfrm>
+                      <a:off x="0" y="0"/>
+                      <a:ext cx="5731510" cy="2870200"/>
+                    </a:xfrm>
+                    <a:prstGeom prst="rect">
+                      <a:avLst/>
+                    </a:prstGeom>
+                  </pic:spPr>
+                </pic:pic>
+              </a:graphicData>
+            </a:graphic>
+          </wp:inline>
+        </w:drawing>
+      </w:r>
+    </w:p>
+    <w:p>
+      <w:pPr>
+        <w:rPr>
+          <w:lang w:val="es-ES"/>
+        </w:rPr>
+      </w:pPr>
+      <w:r>
+        <w:rPr>
+          <w:lang w:val="es-ES"/>
+        </w:rPr>
+        <w:drawing>
+          <wp:inline distT="0" distB="0" distL="0" distR="0" wp14:anchorId="7825B35A" wp14:editId="1AB8A217">
+            <wp:extent cx="5731510" cy="2626360"/>
+            <wp:effectExtent l="0" t="0" r="2540" b="2540"/>
+            <wp:docPr id="156113223" name="Imagen 1"/>
+            <wp:cNvGraphicFramePr>
+              <a:graphicFrameLocks xmlns:a="http://schemas.openxmlformats.org/drawingml/2006/main" noChangeAspect="1"/>
+            </wp:cNvGraphicFramePr>
+            <a:graphic xmlns:a="http://schemas.openxmlformats.org/drawingml/2006/main">
+              <a:graphicData uri="http://schemas.openxmlformats.org/drawingml/2006/picture">
+                <pic:pic xmlns:pic="http://schemas.openxmlformats.org/drawingml/2006/picture">
+                  <pic:nvPicPr>
+                    <pic:cNvPr id="156113223" name=""/>
+                    <pic:cNvPicPr/>
+                  </pic:nvPicPr>
+                  <pic:blipFill>
+                    <a:blip r:embed="rId13"/>
+                    <a:stretch>
+                      <a:fillRect/>
+                    </a:stretch>
+                  </pic:blipFill>
+                  <pic:spPr>
+                    <a:xfrm>
+                      <a:off x="0" y="0"/>
+                      <a:ext cx="5731510" cy="2626360"/>
+                    </a:xfrm>
+                    <a:prstGeom prst="rect">
+                      <a:avLst/>
+                    </a:prstGeom>
+                  </pic:spPr>
+                </pic:pic>
+              </a:graphicData>
+            </a:graphic>
+          </wp:inline>
+        </w:drawing>
+      </w:r>
+    </w:p>
+    <w:p>
+      <w:pPr>
+        <w:rPr>
+          <w:lang w:val="es-ES"/>
+        </w:rPr>
+      </w:pPr>
+      <w:r>
+        <w:rPr>
+          <w:lang w:val="es-ES"/>
+        </w:rPr>
+        <w:lastRenderedPageBreak/>
+        <w:drawing>
+          <wp:inline distT="0" distB="0" distL="0" distR="0" wp14:anchorId="01CD629A" wp14:editId="51C6B5CC">
+            <wp:extent cx="5731510" cy="3281680"/>
+            <wp:effectExtent l="0" t="0" r="2540" b="0"/>
+            <wp:docPr id="1257549362" name="Imagen 1"/>
+            <wp:cNvGraphicFramePr>
+              <a:graphicFrameLocks xmlns:a="http://schemas.openxmlformats.org/drawingml/2006/main" noChangeAspect="1"/>
+            </wp:cNvGraphicFramePr>
+            <a:graphic xmlns:a="http://schemas.openxmlformats.org/drawingml/2006/main">
+              <a:graphicData uri="http://schemas.openxmlformats.org/drawingml/2006/picture">
+                <pic:pic xmlns:pic="http://schemas.openxmlformats.org/drawingml/2006/picture">
+                  <pic:nvPicPr>
+                    <pic:cNvPr id="1257549362" name=""/>
+                    <pic:cNvPicPr/>
+                  </pic:nvPicPr>
+                  <pic:blipFill>
+                    <a:blip r:embed="rId14"/>
+                    <a:stretch>
+                      <a:fillRect/>
+                    </a:stretch>
+                  </pic:blipFill>
+                  <pic:spPr>
+                    <a:xfrm>
+                      <a:off x="0" y="0"/>
+                      <a:ext cx="5731510" cy="3281680"/>
+                    </a:xfrm>
+                    <a:prstGeom prst="rect">
+                      <a:avLst/>
+                    </a:prstGeom>
+                  </pic:spPr>
+                </pic:pic>
+              </a:graphicData>
+            </a:graphic>
+          </wp:inline>
+        </w:drawing>
+      </w:r>
     </w:p>
     <w:sectPr>
       <w:pgSz w:w="11906" w:h="16838"/>

</xml_diff>